<commit_message>
moved comic and badge into doc
</commit_message>
<xml_diff>
--- a/Scouts Electronics Activity Badge Booklet.docx
+++ b/Scouts Electronics Activity Badge Booklet.docx
@@ -939,89 +939,6 @@
                     </pic:cNvPicPr>
                   </pic:nvPicPr>
                   <pic:blipFill>
-                    <a:blip r:embed="rId5">
-                      <a:extLst>
-                        <a:ext uri="{28A0092B-C50C-407E-A947-70E740481C1C}">
-                          <a14:useLocalDpi xmlns:a14="http://schemas.microsoft.com/office/drawing/2010/main" val="0"/>
-                        </a:ext>
-                      </a:extLst>
-                    </a:blip>
-                    <a:srcRect/>
-                    <a:stretch>
-                      <a:fillRect/>
-                    </a:stretch>
-                  </pic:blipFill>
-                  <pic:spPr bwMode="auto">
-                    <a:xfrm>
-                      <a:off x="0" y="0"/>
-                      <a:ext cx="5731510" cy="5731510"/>
-                    </a:xfrm>
-                    <a:prstGeom prst="rect">
-                      <a:avLst/>
-                    </a:prstGeom>
-                    <a:noFill/>
-                    <a:ln>
-                      <a:noFill/>
-                    </a:ln>
-                  </pic:spPr>
-                </pic:pic>
-              </a:graphicData>
-            </a:graphic>
-          </wp:inline>
-        </w:drawing>
-      </w:r>
-    </w:p>
-    <w:p>
-      <w:pPr>
-        <w:rPr>
-          <w:rFonts w:ascii="Calibri" w:hAnsi="Calibri" w:cs="Calibri"/>
-          <w:b/>
-          <w:bCs/>
-        </w:rPr>
-      </w:pPr>
-      <w:hyperlink r:id="rId6" w:history="1">
-        <w:r>
-          <w:rPr>
-            <w:rStyle w:val="Hyperlink"/>
-            <w:rFonts w:ascii="Calibri" w:hAnsi="Calibri" w:cs="Calibri"/>
-            <w:b/>
-            <w:bCs/>
-          </w:rPr>
-          <w:t>https://thepihut.com/products/precision-diagonal-cutters</w:t>
-        </w:r>
-      </w:hyperlink>
-    </w:p>
-    <w:p>
-      <w:pPr>
-        <w:rPr>
-          <w:rFonts w:ascii="Calibri" w:hAnsi="Calibri" w:cs="Calibri"/>
-          <w:b/>
-          <w:bCs/>
-        </w:rPr>
-      </w:pPr>
-      <w:r>
-        <w:rPr>
-          <w:noProof/>
-        </w:rPr>
-        <w:lastRenderedPageBreak/>
-        <w:drawing>
-          <wp:inline distT="0" distB="0" distL="0" distR="0" wp14:anchorId="658721C8" wp14:editId="704061B8">
-            <wp:extent cx="5731510" cy="5731510"/>
-            <wp:effectExtent l="0" t="0" r="2540" b="2540"/>
-            <wp:docPr id="59154515" name="Picture 3" descr="38 In 1 Interchangeable precise tool set by Seeed - The Pi Hut"/>
-            <wp:cNvGraphicFramePr>
-              <a:graphicFrameLocks xmlns:a="http://schemas.openxmlformats.org/drawingml/2006/main" noChangeAspect="1"/>
-            </wp:cNvGraphicFramePr>
-            <a:graphic xmlns:a="http://schemas.openxmlformats.org/drawingml/2006/main">
-              <a:graphicData uri="http://schemas.openxmlformats.org/drawingml/2006/picture">
-                <pic:pic xmlns:pic="http://schemas.openxmlformats.org/drawingml/2006/picture">
-                  <pic:nvPicPr>
-                    <pic:cNvPr id="0" name="Picture 5" descr="38 In 1 Interchangeable precise tool set by Seeed - The Pi Hut"/>
-                    <pic:cNvPicPr>
-                      <a:picLocks noChangeAspect="1" noChangeArrowheads="1"/>
-                    </pic:cNvPicPr>
-                  </pic:nvPicPr>
-                  <pic:blipFill>
                     <a:blip r:embed="rId7">
                       <a:extLst>
                         <a:ext uri="{28A0092B-C50C-407E-A947-70E740481C1C}">
@@ -1053,43 +970,45 @@
           </wp:inline>
         </w:drawing>
       </w:r>
-      <w:r>
+    </w:p>
+    <w:p>
+      <w:pPr>
         <w:rPr>
           <w:rFonts w:ascii="Calibri" w:hAnsi="Calibri" w:cs="Calibri"/>
           <w:b/>
           <w:bCs/>
         </w:rPr>
-        <w:t>https://thepihut.com/products/38-in-1-interchangeable-precise-tool-set</w:t>
-      </w:r>
-    </w:p>
-    <w:p>
-      <w:r>
+      </w:pPr>
+      <w:hyperlink r:id="rId8" w:history="1">
+        <w:r>
+          <w:rPr>
+            <w:rStyle w:val="Hyperlink"/>
+            <w:rFonts w:ascii="Calibri" w:hAnsi="Calibri" w:cs="Calibri"/>
+            <w:b/>
+            <w:bCs/>
+          </w:rPr>
+          <w:t>https://thepihut.com/products/precision-diagonal-cutters</w:t>
+        </w:r>
+      </w:hyperlink>
+    </w:p>
+    <w:p>
+      <w:pPr>
         <w:rPr>
           <w:rFonts w:ascii="Calibri" w:hAnsi="Calibri" w:cs="Calibri"/>
           <w:b/>
           <w:bCs/>
         </w:rPr>
+      </w:pPr>
+      <w:r>
+        <w:rPr>
+          <w:noProof/>
+        </w:rPr>
         <w:lastRenderedPageBreak/>
-        <w:t xml:space="preserve"> </w:t>
-      </w:r>
-      <w:r>
-        <w:fldChar w:fldCharType="begin"/>
-      </w:r>
-      <w:r>
-        <w:instrText xml:space="preserve"> INCLUDEPICTURE "https://m.media-amazon.com/images/I/61k+OLlMTAL._AC_SL1080_.jpg" \* MERGEFORMATINET </w:instrText>
-      </w:r>
-      <w:r>
-        <w:fldChar w:fldCharType="separate"/>
-      </w:r>
-      <w:r>
-        <w:rPr>
-          <w:noProof/>
-        </w:rPr>
         <w:drawing>
-          <wp:inline distT="0" distB="0" distL="0" distR="0" wp14:anchorId="0DB5C321" wp14:editId="4285C8F5">
-            <wp:extent cx="5731510" cy="5823585"/>
-            <wp:effectExtent l="0" t="0" r="0" b="5715"/>
-            <wp:docPr id="124706301" name="Picture 1" descr="A set of tools and accessories&#10;&#10;AI-generated content may be incorrect."/>
+          <wp:inline distT="0" distB="0" distL="0" distR="0" wp14:anchorId="658721C8" wp14:editId="704061B8">
+            <wp:extent cx="5731510" cy="5731510"/>
+            <wp:effectExtent l="0" t="0" r="2540" b="2540"/>
+            <wp:docPr id="59154515" name="Picture 3" descr="38 In 1 Interchangeable precise tool set by Seeed - The Pi Hut"/>
             <wp:cNvGraphicFramePr>
               <a:graphicFrameLocks xmlns:a="http://schemas.openxmlformats.org/drawingml/2006/main" noChangeAspect="1"/>
             </wp:cNvGraphicFramePr>
@@ -1097,99 +1016,13 @@
               <a:graphicData uri="http://schemas.openxmlformats.org/drawingml/2006/picture">
                 <pic:pic xmlns:pic="http://schemas.openxmlformats.org/drawingml/2006/picture">
                   <pic:nvPicPr>
-                    <pic:cNvPr id="124706301" name="Picture 1" descr="A set of tools and accessories&#10;&#10;AI-generated content may be incorrect."/>
+                    <pic:cNvPr id="0" name="Picture 5" descr="38 In 1 Interchangeable precise tool set by Seeed - The Pi Hut"/>
                     <pic:cNvPicPr>
                       <a:picLocks noChangeAspect="1" noChangeArrowheads="1"/>
                     </pic:cNvPicPr>
                   </pic:nvPicPr>
                   <pic:blipFill>
-                    <a:blip r:embed="rId8">
-                      <a:extLst>
-                        <a:ext uri="{28A0092B-C50C-407E-A947-70E740481C1C}">
-                          <a14:useLocalDpi xmlns:a14="http://schemas.microsoft.com/office/drawing/2010/main" val="0"/>
-                        </a:ext>
-                      </a:extLst>
-                    </a:blip>
-                    <a:srcRect/>
-                    <a:stretch>
-                      <a:fillRect/>
-                    </a:stretch>
-                  </pic:blipFill>
-                  <pic:spPr bwMode="auto">
-                    <a:xfrm>
-                      <a:off x="0" y="0"/>
-                      <a:ext cx="5731510" cy="5823585"/>
-                    </a:xfrm>
-                    <a:prstGeom prst="rect">
-                      <a:avLst/>
-                    </a:prstGeom>
-                    <a:noFill/>
-                    <a:ln>
-                      <a:noFill/>
-                    </a:ln>
-                  </pic:spPr>
-                </pic:pic>
-              </a:graphicData>
-            </a:graphic>
-          </wp:inline>
-        </w:drawing>
-      </w:r>
-      <w:r>
-        <w:fldChar w:fldCharType="end"/>
-      </w:r>
-    </w:p>
-    <w:p>
-      <w:pPr>
-        <w:rPr>
-          <w:rFonts w:ascii="Calibri" w:hAnsi="Calibri" w:cs="Calibri"/>
-          <w:b/>
-          <w:bCs/>
-        </w:rPr>
-      </w:pPr>
-      <w:hyperlink r:id="rId9" w:history="1">
-        <w:r>
-          <w:rPr>
-            <w:rStyle w:val="Hyperlink"/>
-            <w:rFonts w:ascii="Calibri" w:hAnsi="Calibri" w:cs="Calibri"/>
-            <w:b/>
-            <w:bCs/>
-          </w:rPr>
-          <w:t>https://amzn.to/4a0yyuT</w:t>
-        </w:r>
-      </w:hyperlink>
-    </w:p>
-    <w:p>
-      <w:pPr>
-        <w:rPr>
-          <w:rFonts w:ascii="Calibri" w:hAnsi="Calibri" w:cs="Calibri"/>
-          <w:b/>
-          <w:bCs/>
-        </w:rPr>
-      </w:pPr>
-      <w:r>
-        <w:rPr>
-          <w:noProof/>
-        </w:rPr>
-        <w:lastRenderedPageBreak/>
-        <w:drawing>
-          <wp:inline distT="0" distB="0" distL="0" distR="0" wp14:anchorId="3FA48433" wp14:editId="423D7132">
-            <wp:extent cx="5731510" cy="5731510"/>
-            <wp:effectExtent l="0" t="0" r="2540" b="2540"/>
-            <wp:docPr id="774764065" name="Picture 2" descr="Multifunction Wire Strippers by The Pi Hut - The Pi Hut"/>
-            <wp:cNvGraphicFramePr>
-              <a:graphicFrameLocks xmlns:a="http://schemas.openxmlformats.org/drawingml/2006/main" noChangeAspect="1"/>
-            </wp:cNvGraphicFramePr>
-            <a:graphic xmlns:a="http://schemas.openxmlformats.org/drawingml/2006/main">
-              <a:graphicData uri="http://schemas.openxmlformats.org/drawingml/2006/picture">
-                <pic:pic xmlns:pic="http://schemas.openxmlformats.org/drawingml/2006/picture">
-                  <pic:nvPicPr>
-                    <pic:cNvPr id="0" name="Picture 3" descr="Multifunction Wire Strippers by The Pi Hut - The Pi Hut"/>
-                    <pic:cNvPicPr>
-                      <a:picLocks noChangeAspect="1" noChangeArrowheads="1"/>
-                    </pic:cNvPicPr>
-                  </pic:nvPicPr>
-                  <pic:blipFill>
-                    <a:blip r:embed="rId10">
+                    <a:blip r:embed="rId9">
                       <a:extLst>
                         <a:ext uri="{28A0092B-C50C-407E-A947-70E740481C1C}">
                           <a14:useLocalDpi xmlns:a14="http://schemas.microsoft.com/office/drawing/2010/main" val="0"/>
@@ -1220,34 +1053,176 @@
           </wp:inline>
         </w:drawing>
       </w:r>
-    </w:p>
-    <w:p>
-      <w:pPr>
+      <w:r>
         <w:rPr>
           <w:rFonts w:ascii="Calibri" w:hAnsi="Calibri" w:cs="Calibri"/>
           <w:b/>
           <w:bCs/>
         </w:rPr>
-      </w:pPr>
+        <w:t>https://thepihut.com/products/38-in-1-interchangeable-precise-tool-set</w:t>
+      </w:r>
+    </w:p>
+    <w:p>
       <w:r>
         <w:rPr>
           <w:rFonts w:ascii="Calibri" w:hAnsi="Calibri" w:cs="Calibri"/>
           <w:b/>
           <w:bCs/>
         </w:rPr>
-        <w:t>https://thepihut.com/products/wire-strippers</w:t>
-      </w:r>
-    </w:p>
-    <w:p>
+        <w:lastRenderedPageBreak/>
+        <w:t xml:space="preserve"> </w:t>
+      </w:r>
+      <w:r>
+        <w:fldChar w:fldCharType="begin"/>
+      </w:r>
+      <w:r>
+        <w:instrText xml:space="preserve"> INCLUDEPICTURE "https://m.media-amazon.com/images/I/61k+OLlMTAL._AC_SL1080_.jpg" \* MERGEFORMATINET </w:instrText>
+      </w:r>
+      <w:r>
+        <w:fldChar w:fldCharType="separate"/>
+      </w:r>
+      <w:r>
+        <w:rPr>
+          <w:noProof/>
+        </w:rPr>
+        <w:pict w14:anchorId="497CA1FC">
+          <v:shapetype id="_x0000_t75" coordsize="21600,21600" o:spt="75" o:preferrelative="t" path="m@4@5l@4@11@9@11@9@5xe" filled="f" stroked="f">
+            <v:stroke joinstyle="miter"/>
+            <v:formulas>
+              <v:f eqn="if lineDrawn pixelLineWidth 0"/>
+              <v:f eqn="sum @0 1 0"/>
+              <v:f eqn="sum 0 0 @1"/>
+              <v:f eqn="prod @2 1 2"/>
+              <v:f eqn="prod @3 21600 pixelWidth"/>
+              <v:f eqn="prod @3 21600 pixelHeight"/>
+              <v:f eqn="sum @0 0 1"/>
+              <v:f eqn="prod @6 1 2"/>
+              <v:f eqn="prod @7 21600 pixelWidth"/>
+              <v:f eqn="sum @8 21600 0"/>
+              <v:f eqn="prod @7 21600 pixelHeight"/>
+              <v:f eqn="sum @10 21600 0"/>
+            </v:formulas>
+            <v:path o:extrusionok="f" gradientshapeok="t" o:connecttype="rect"/>
+            <o:lock v:ext="edit" aspectratio="t"/>
+          </v:shapetype>
+          <v:shape id="_x0000_i1033" type="#_x0000_t75" style="width:312.4pt;height:317.45pt">
+            <v:imagedata r:id="rId10" r:href="rId11"/>
+          </v:shape>
+        </w:pict>
+      </w:r>
+      <w:r>
+        <w:fldChar w:fldCharType="end"/>
+      </w:r>
+    </w:p>
+    <w:p>
+      <w:pPr>
+        <w:rPr>
+          <w:rFonts w:ascii="Calibri" w:hAnsi="Calibri" w:cs="Calibri"/>
+          <w:b/>
+          <w:bCs/>
+        </w:rPr>
+      </w:pPr>
+      <w:hyperlink r:id="rId12" w:history="1">
+        <w:r>
+          <w:rPr>
+            <w:rStyle w:val="Hyperlink"/>
+            <w:rFonts w:ascii="Calibri" w:hAnsi="Calibri" w:cs="Calibri"/>
+            <w:b/>
+            <w:bCs/>
+          </w:rPr>
+          <w:t>https://amzn.to/4a0yyuT</w:t>
+        </w:r>
+      </w:hyperlink>
+    </w:p>
+    <w:p>
+      <w:pPr>
+        <w:rPr>
+          <w:rFonts w:ascii="Calibri" w:hAnsi="Calibri" w:cs="Calibri"/>
+          <w:b/>
+          <w:bCs/>
+        </w:rPr>
+      </w:pPr>
       <w:r>
         <w:rPr>
           <w:noProof/>
         </w:rPr>
         <w:lastRenderedPageBreak/>
         <w:drawing>
-          <wp:inline distT="0" distB="0" distL="0" distR="0" wp14:anchorId="3575324C" wp14:editId="0B455CC1">
-            <wp:extent cx="5731510" cy="5731510"/>
-            <wp:effectExtent l="0" t="0" r="2540" b="2540"/>
+          <wp:inline distT="0" distB="0" distL="0" distR="0" wp14:anchorId="3FA48433" wp14:editId="76CC5E09">
+            <wp:extent cx="2775005" cy="2775005"/>
+            <wp:effectExtent l="0" t="0" r="6350" b="6350"/>
+            <wp:docPr id="774764065" name="Picture 2" descr="Multifunction Wire Strippers by The Pi Hut - The Pi Hut"/>
+            <wp:cNvGraphicFramePr>
+              <a:graphicFrameLocks xmlns:a="http://schemas.openxmlformats.org/drawingml/2006/main" noChangeAspect="1"/>
+            </wp:cNvGraphicFramePr>
+            <a:graphic xmlns:a="http://schemas.openxmlformats.org/drawingml/2006/main">
+              <a:graphicData uri="http://schemas.openxmlformats.org/drawingml/2006/picture">
+                <pic:pic xmlns:pic="http://schemas.openxmlformats.org/drawingml/2006/picture">
+                  <pic:nvPicPr>
+                    <pic:cNvPr id="0" name="Picture 3" descr="Multifunction Wire Strippers by The Pi Hut - The Pi Hut"/>
+                    <pic:cNvPicPr>
+                      <a:picLocks noChangeAspect="1" noChangeArrowheads="1"/>
+                    </pic:cNvPicPr>
+                  </pic:nvPicPr>
+                  <pic:blipFill>
+                    <a:blip r:embed="rId13">
+                      <a:extLst>
+                        <a:ext uri="{28A0092B-C50C-407E-A947-70E740481C1C}">
+                          <a14:useLocalDpi xmlns:a14="http://schemas.microsoft.com/office/drawing/2010/main" val="0"/>
+                        </a:ext>
+                      </a:extLst>
+                    </a:blip>
+                    <a:srcRect/>
+                    <a:stretch>
+                      <a:fillRect/>
+                    </a:stretch>
+                  </pic:blipFill>
+                  <pic:spPr bwMode="auto">
+                    <a:xfrm>
+                      <a:off x="0" y="0"/>
+                      <a:ext cx="2780282" cy="2780282"/>
+                    </a:xfrm>
+                    <a:prstGeom prst="rect">
+                      <a:avLst/>
+                    </a:prstGeom>
+                    <a:noFill/>
+                    <a:ln>
+                      <a:noFill/>
+                    </a:ln>
+                  </pic:spPr>
+                </pic:pic>
+              </a:graphicData>
+            </a:graphic>
+          </wp:inline>
+        </w:drawing>
+      </w:r>
+    </w:p>
+    <w:p>
+      <w:pPr>
+        <w:rPr>
+          <w:rFonts w:ascii="Calibri" w:hAnsi="Calibri" w:cs="Calibri"/>
+          <w:b/>
+          <w:bCs/>
+        </w:rPr>
+      </w:pPr>
+      <w:r>
+        <w:rPr>
+          <w:rFonts w:ascii="Calibri" w:hAnsi="Calibri" w:cs="Calibri"/>
+          <w:b/>
+          <w:bCs/>
+        </w:rPr>
+        <w:t>https://thepihut.com/products/wire-strippers</w:t>
+      </w:r>
+    </w:p>
+    <w:p>
+      <w:r>
+        <w:rPr>
+          <w:noProof/>
+        </w:rPr>
+        <w:drawing>
+          <wp:inline distT="0" distB="0" distL="0" distR="0" wp14:anchorId="3575324C" wp14:editId="0A1B897E">
+            <wp:extent cx="2769649" cy="2769649"/>
+            <wp:effectExtent l="0" t="0" r="0" b="0"/>
             <wp:docPr id="235186956" name="Picture 4" descr="Digital Multimeter - Model 9205B+ by Adafruit - The Pi Hut"/>
             <wp:cNvGraphicFramePr>
               <a:graphicFrameLocks xmlns:a="http://schemas.openxmlformats.org/drawingml/2006/main" noChangeAspect="1"/>
@@ -1262,7 +1237,7 @@
                     </pic:cNvPicPr>
                   </pic:nvPicPr>
                   <pic:blipFill>
-                    <a:blip r:embed="rId11">
+                    <a:blip r:embed="rId14" cstate="print">
                       <a:extLst>
                         <a:ext uri="{28A0092B-C50C-407E-A947-70E740481C1C}">
                           <a14:useLocalDpi xmlns:a14="http://schemas.microsoft.com/office/drawing/2010/main" val="0"/>
@@ -1277,7 +1252,7 @@
                   <pic:spPr bwMode="auto">
                     <a:xfrm>
                       <a:off x="0" y="0"/>
-                      <a:ext cx="5731510" cy="5731510"/>
+                      <a:ext cx="2773971" cy="2773971"/>
                     </a:xfrm>
                     <a:prstGeom prst="rect">
                       <a:avLst/>
@@ -1295,7 +1270,7 @@
       </w:r>
     </w:p>
     <w:p>
-      <w:hyperlink r:id="rId12" w:history="1">
+      <w:hyperlink r:id="rId15" w:history="1">
         <w:r>
           <w:rPr>
             <w:rStyle w:val="Hyperlink"/>
@@ -1306,6 +1281,7 @@
     </w:p>
     <w:p>
       <w:r>
+        <w:lastRenderedPageBreak/>
         <w:fldChar w:fldCharType="begin"/>
       </w:r>
       <w:r>
@@ -1313,6 +1289,13 @@
       </w:r>
       <w:r>
         <w:fldChar w:fldCharType="separate"/>
+      </w:r>
+      <w:r>
+        <w:pict w14:anchorId="33C34514">
+          <v:shape id="_x0000_i1035" type="#_x0000_t75" style="width:200.65pt;height:202.85pt">
+            <v:imagedata r:id="rId16" r:href="rId17"/>
+          </v:shape>
+        </w:pict>
       </w:r>
       <w:r>
         <w:fldChar w:fldCharType="end"/>
@@ -1332,7 +1315,6 @@
           <w:b/>
           <w:bCs/>
         </w:rPr>
-        <w:lastRenderedPageBreak/>
         <w:br w:type="page"/>
       </w:r>
     </w:p>
@@ -1408,7 +1390,7 @@
       <w:r>
         <w:t xml:space="preserve">a lead-free solder, like </w:t>
       </w:r>
-      <w:hyperlink r:id="rId13" w:history="1">
+      <w:hyperlink r:id="rId18" w:history="1">
         <w:r>
           <w:rPr>
             <w:rStyle w:val="Hyperlink"/>
@@ -1443,7 +1425,7 @@
       <w:r>
         <w:t>(</w:t>
       </w:r>
-      <w:hyperlink r:id="rId14" w:history="1">
+      <w:hyperlink r:id="rId19" w:history="1">
         <w:r>
           <w:rPr>
             <w:rStyle w:val="Hyperlink"/>
@@ -12912,9 +12894,7 @@
           <w14:ligatures w14:val="none"/>
         </w:rPr>
       </w:pPr>
-    </w:p>
-    <w:p>
-      <w:pPr>
+      <w:r>
         <w:rPr>
           <w:rFonts w:ascii="Helvetica" w:eastAsia="Times New Roman" w:hAnsi="Helvetica" w:cs="Times New Roman"/>
           <w:color w:val="000000"/>
@@ -12924,7 +12904,8 @@
           <w:lang w:eastAsia="en-GB"/>
           <w14:ligatures w14:val="none"/>
         </w:rPr>
-      </w:pPr>
+        <w:br w:type="page"/>
+      </w:r>
     </w:p>
     <w:p>
       <w:pPr>
@@ -12938,9 +12919,7 @@
           <w14:ligatures w14:val="none"/>
         </w:rPr>
       </w:pPr>
-    </w:p>
-    <w:p>
-      <w:pPr>
+      <w:r>
         <w:rPr>
           <w:rFonts w:ascii="Helvetica" w:eastAsia="Times New Roman" w:hAnsi="Helvetica" w:cs="Times New Roman"/>
           <w:color w:val="000000"/>
@@ -12950,10 +12929,11 @@
           <w:lang w:eastAsia="en-GB"/>
           <w14:ligatures w14:val="none"/>
         </w:rPr>
-      </w:pPr>
-    </w:p>
-    <w:p>
-      <w:pPr>
+        <w:lastRenderedPageBreak/>
+        <w:t xml:space="preserve">Charly </w:t>
+      </w:r>
+      <w:proofErr w:type="spellStart"/>
+      <w:r>
         <w:rPr>
           <w:rFonts w:ascii="Helvetica" w:eastAsia="Times New Roman" w:hAnsi="Helvetica" w:cs="Times New Roman"/>
           <w:color w:val="000000"/>
@@ -12963,7 +12943,9 @@
           <w:lang w:eastAsia="en-GB"/>
           <w14:ligatures w14:val="none"/>
         </w:rPr>
-      </w:pPr>
+        <w:t>Plexing</w:t>
+      </w:r>
+      <w:proofErr w:type="spellEnd"/>
     </w:p>
     <w:p>
       <w:pPr>
@@ -13005,6 +12987,136 @@
     </w:p>
     <w:p>
       <w:pPr>
+        <w:pStyle w:val="Heading1"/>
+        <w:rPr>
+          <w:rFonts w:eastAsia="Times New Roman"/>
+          <w:lang w:eastAsia="en-GB"/>
+        </w:rPr>
+      </w:pPr>
+      <w:r>
+        <w:rPr>
+          <w:rFonts w:eastAsia="Times New Roman"/>
+          <w:lang w:eastAsia="en-GB"/>
+        </w:rPr>
+        <w:lastRenderedPageBreak/>
+        <w:t>Woggle</w:t>
+      </w:r>
+    </w:p>
+    <w:p>
+      <w:pPr>
+        <w:rPr>
+          <w:lang w:eastAsia="en-GB"/>
+        </w:rPr>
+      </w:pPr>
+      <w:r>
+        <w:rPr>
+          <w:lang w:eastAsia="en-GB"/>
+        </w:rPr>
+        <w:t xml:space="preserve">This is derived from the Scouts Queensland </w:t>
+      </w:r>
+      <w:proofErr w:type="spellStart"/>
+      <w:r>
+        <w:rPr>
+          <w:lang w:eastAsia="en-GB"/>
+        </w:rPr>
+        <w:t>eWoggle</w:t>
+      </w:r>
+      <w:proofErr w:type="spellEnd"/>
+      <w:r>
+        <w:rPr>
+          <w:lang w:eastAsia="en-GB"/>
+        </w:rPr>
+        <w:t>, and follows the design principles laid out in the document “</w:t>
+      </w:r>
+      <w:r>
+        <w:rPr>
+          <w:lang w:eastAsia="en-GB"/>
+        </w:rPr>
+        <w:t xml:space="preserve">Circuit design principles for </w:t>
+      </w:r>
+      <w:r>
+        <w:rPr>
+          <w:lang w:eastAsia="en-GB"/>
+        </w:rPr>
+        <w:t>Scout electronics projects for JOTA/JOTI</w:t>
+      </w:r>
+      <w:r>
+        <w:rPr>
+          <w:lang w:eastAsia="en-GB"/>
+        </w:rPr>
+        <w:t>”</w:t>
+      </w:r>
+      <w:r>
+        <w:rPr>
+          <w:lang w:eastAsia="en-GB"/>
+        </w:rPr>
+        <w:t xml:space="preserve"> by Michael Gross of Cobargo Venturers (</w:t>
+      </w:r>
+      <w:hyperlink r:id="rId20" w:history="1">
+        <w:r>
+          <w:rPr>
+            <w:lang w:eastAsia="en-GB"/>
+          </w:rPr>
+          <w:t>https://cobargoscouts.org.au/jota-joti-electronics.html</w:t>
+        </w:r>
+      </w:hyperlink>
+      <w:r>
+        <w:rPr>
+          <w:lang w:eastAsia="en-GB"/>
+        </w:rPr>
+        <w:t xml:space="preserve">), I have also combined the functionality of the </w:t>
+      </w:r>
+      <w:proofErr w:type="spellStart"/>
+      <w:r>
+        <w:rPr>
+          <w:lang w:eastAsia="en-GB"/>
+        </w:rPr>
+        <w:t>eWoggle</w:t>
+      </w:r>
+      <w:proofErr w:type="spellEnd"/>
+      <w:r>
+        <w:rPr>
+          <w:lang w:eastAsia="en-GB"/>
+        </w:rPr>
+        <w:t xml:space="preserve"> with the </w:t>
+      </w:r>
+      <w:proofErr w:type="spellStart"/>
+      <w:r>
+        <w:rPr>
+          <w:lang w:eastAsia="en-GB"/>
+        </w:rPr>
+        <w:t>Franzininho</w:t>
+      </w:r>
+      <w:proofErr w:type="spellEnd"/>
+      <w:r>
+        <w:rPr>
+          <w:lang w:eastAsia="en-GB"/>
+        </w:rPr>
+        <w:t xml:space="preserve"> DIY (</w:t>
+      </w:r>
+      <w:hyperlink r:id="rId21" w:history="1">
+        <w:r>
+          <w:rPr>
+            <w:lang w:eastAsia="en-GB"/>
+          </w:rPr>
+          <w:t>https://docs.franzininho.com.br/docs/franzininho-diy/sobre</w:t>
+        </w:r>
+      </w:hyperlink>
+      <w:r>
+        <w:rPr>
+          <w:lang w:eastAsia="en-GB"/>
+        </w:rPr>
+        <w:t>) Arduino like capabilities allowing the scouts to upload new firmware after they have assembled their woggles</w:t>
+      </w:r>
+      <w:r>
+        <w:rPr>
+          <w:lang w:eastAsia="en-GB"/>
+        </w:rPr>
+        <w:t>.</w:t>
+      </w:r>
+    </w:p>
+    <w:p>
+      <w:pPr>
         <w:rPr>
           <w:rFonts w:ascii="Helvetica" w:eastAsia="Times New Roman" w:hAnsi="Helvetica" w:cs="Times New Roman"/>
           <w:color w:val="000000"/>
@@ -13025,53 +13137,168 @@
           <w:lang w:eastAsia="en-GB"/>
           <w14:ligatures w14:val="none"/>
         </w:rPr>
+        <w:br w:type="page"/>
+      </w:r>
+    </w:p>
+    <w:p>
+      <w:pPr>
+        <w:pStyle w:val="Heading2"/>
+        <w:rPr>
+          <w:rFonts w:eastAsia="Times New Roman"/>
+          <w:lang w:eastAsia="en-GB"/>
+        </w:rPr>
+      </w:pPr>
+      <w:r>
+        <w:rPr>
+          <w:rFonts w:eastAsia="Times New Roman"/>
+          <w:lang w:eastAsia="en-GB"/>
+        </w:rPr>
         <w:lastRenderedPageBreak/>
-        <w:t xml:space="preserve">Charly </w:t>
+        <w:t xml:space="preserve">Woggle </w:t>
       </w:r>
       <w:proofErr w:type="spellStart"/>
       <w:r>
         <w:rPr>
-          <w:rFonts w:ascii="Helvetica" w:eastAsia="Times New Roman" w:hAnsi="Helvetica" w:cs="Times New Roman"/>
-          <w:color w:val="000000"/>
-          <w:kern w:val="0"/>
-          <w:sz w:val="14"/>
-          <w:szCs w:val="14"/>
-          <w:lang w:eastAsia="en-GB"/>
-          <w14:ligatures w14:val="none"/>
-        </w:rPr>
-        <w:t>Plexing</w:t>
+          <w:rFonts w:eastAsia="Times New Roman"/>
+          <w:lang w:eastAsia="en-GB"/>
+        </w:rPr>
+        <w:t>KiCad</w:t>
       </w:r>
       <w:proofErr w:type="spellEnd"/>
-    </w:p>
-    <w:p>
-      <w:pPr>
-        <w:rPr>
-          <w:rFonts w:ascii="Helvetica" w:eastAsia="Times New Roman" w:hAnsi="Helvetica" w:cs="Times New Roman"/>
-          <w:color w:val="000000"/>
-          <w:kern w:val="0"/>
-          <w:sz w:val="14"/>
-          <w:szCs w:val="14"/>
-          <w:lang w:eastAsia="en-GB"/>
-          <w14:ligatures w14:val="none"/>
-        </w:rPr>
-      </w:pPr>
-      <w:r>
-        <w:rPr>
-          <w:rFonts w:ascii="Helvetica" w:eastAsia="Times New Roman" w:hAnsi="Helvetica" w:cs="Times New Roman"/>
-          <w:noProof/>
-          <w:color w:val="000000"/>
-          <w:kern w:val="0"/>
-          <w:sz w:val="14"/>
-          <w:szCs w:val="14"/>
-          <w:lang w:eastAsia="en-GB"/>
-          <w14:ligatures w14:val="none"/>
+      <w:r>
+        <w:rPr>
+          <w:rFonts w:eastAsia="Times New Roman"/>
+          <w:lang w:eastAsia="en-GB"/>
+        </w:rPr>
+        <w:t xml:space="preserve"> files</w:t>
+      </w:r>
+    </w:p>
+    <w:p>
+      <w:pPr>
+        <w:rPr>
+          <w:lang w:eastAsia="en-GB"/>
+        </w:rPr>
+      </w:pPr>
+      <w:r>
+        <w:rPr>
+          <w:lang w:eastAsia="en-GB"/>
+        </w:rPr>
+        <w:t xml:space="preserve">The woggle was designed in </w:t>
+      </w:r>
+      <w:proofErr w:type="spellStart"/>
+      <w:r>
+        <w:rPr>
+          <w:lang w:eastAsia="en-GB"/>
+        </w:rPr>
+        <w:t>KiCad</w:t>
+      </w:r>
+      <w:proofErr w:type="spellEnd"/>
+      <w:r>
+        <w:rPr>
+          <w:lang w:eastAsia="en-GB"/>
+        </w:rPr>
+        <w:t xml:space="preserve">, </w:t>
+      </w:r>
+    </w:p>
+    <w:p>
+      <w:pPr>
+        <w:rPr>
+          <w:lang w:eastAsia="en-GB"/>
+        </w:rPr>
+      </w:pPr>
+      <w:r>
+        <w:rPr>
+          <w:lang w:eastAsia="en-GB"/>
+        </w:rPr>
+        <w:br w:type="page"/>
+      </w:r>
+    </w:p>
+    <w:p>
+      <w:pPr>
+        <w:rPr>
+          <w:lang w:eastAsia="en-GB"/>
+        </w:rPr>
+      </w:pPr>
+      <w:r>
+        <w:rPr>
+          <w:lang w:eastAsia="en-GB"/>
         </w:rPr>
         <w:lastRenderedPageBreak/>
+        <w:br w:type="page"/>
+      </w:r>
+    </w:p>
+    <w:p>
+      <w:pPr>
+        <w:rPr>
+          <w:lang w:eastAsia="en-GB"/>
+        </w:rPr>
+      </w:pPr>
+      <w:r>
+        <w:rPr>
+          <w:lang w:eastAsia="en-GB"/>
+        </w:rPr>
+        <w:lastRenderedPageBreak/>
+        <w:br w:type="page"/>
+      </w:r>
+    </w:p>
+    <w:p>
+      <w:pPr>
+        <w:pStyle w:val="Heading1"/>
+        <w:rPr>
+          <w:lang w:eastAsia="en-GB"/>
+        </w:rPr>
+      </w:pPr>
+      <w:r>
+        <w:rPr>
+          <w:lang w:eastAsia="en-GB"/>
+        </w:rPr>
+        <w:lastRenderedPageBreak/>
+        <w:t>Soldering is Easy</w:t>
+      </w:r>
+    </w:p>
+    <w:p>
+      <w:pPr>
+        <w:rPr>
+          <w:lang w:eastAsia="en-GB"/>
+        </w:rPr>
+      </w:pPr>
+      <w:r>
+        <w:rPr>
+          <w:lang w:eastAsia="en-GB"/>
+        </w:rPr>
+        <w:t xml:space="preserve">The following graphical guide is by Mitch Altman, Andie Nordgren and Jeff Keyzer. And is available in other languages and to download at </w:t>
+      </w:r>
+      <w:hyperlink r:id="rId22" w:history="1">
+        <w:r>
+          <w:rPr>
+            <w:rStyle w:val="Hyperlink"/>
+            <w:lang w:eastAsia="en-GB"/>
+          </w:rPr>
+          <w:t>https://mightyohm.com/soldercomic</w:t>
+        </w:r>
+      </w:hyperlink>
+      <w:r>
+        <w:rPr>
+          <w:lang w:eastAsia="en-GB"/>
+        </w:rPr>
+        <w:t xml:space="preserve"> </w:t>
+      </w:r>
+    </w:p>
+    <w:p>
+      <w:pPr>
+        <w:rPr>
+          <w:lang w:eastAsia="en-GB"/>
+        </w:rPr>
+      </w:pPr>
+      <w:r>
+        <w:rPr>
+          <w:lang w:eastAsia="en-GB"/>
+        </w:rPr>
         <w:drawing>
-          <wp:inline distT="0" distB="0" distL="0" distR="0" wp14:anchorId="60A50ABE" wp14:editId="0F5448EA">
-            <wp:extent cx="5729605" cy="6870065"/>
-            <wp:effectExtent l="0" t="0" r="4445" b="6985"/>
-            <wp:docPr id="1219846762" name="Picture 1"/>
+          <wp:inline distT="0" distB="0" distL="0" distR="0" wp14:anchorId="692FCC77" wp14:editId="0C78D4C6">
+            <wp:extent cx="3974465" cy="5014595"/>
+            <wp:effectExtent l="0" t="0" r="6985" b="0"/>
+            <wp:docPr id="1170412614" name="Picture 1"/>
             <wp:cNvGraphicFramePr>
               <a:graphicFrameLocks xmlns:a="http://schemas.openxmlformats.org/drawingml/2006/main" noChangeAspect="1"/>
             </wp:cNvGraphicFramePr>
@@ -13079,36 +13306,23 @@
               <a:graphicData uri="http://schemas.openxmlformats.org/drawingml/2006/picture">
                 <pic:pic xmlns:pic="http://schemas.openxmlformats.org/drawingml/2006/picture">
                   <pic:nvPicPr>
-                    <pic:cNvPr id="0" name="Picture 1"/>
-                    <pic:cNvPicPr>
-                      <a:picLocks noChangeAspect="1" noChangeArrowheads="1"/>
-                    </pic:cNvPicPr>
+                    <pic:cNvPr id="1170412614" name=""/>
+                    <pic:cNvPicPr/>
                   </pic:nvPicPr>
                   <pic:blipFill>
-                    <a:blip r:embed="rId15">
-                      <a:extLst>
-                        <a:ext uri="{28A0092B-C50C-407E-A947-70E740481C1C}">
-                          <a14:useLocalDpi xmlns:a14="http://schemas.microsoft.com/office/drawing/2010/main" val="0"/>
-                        </a:ext>
-                      </a:extLst>
-                    </a:blip>
-                    <a:srcRect/>
+                    <a:blip r:embed="rId23"/>
                     <a:stretch>
                       <a:fillRect/>
                     </a:stretch>
                   </pic:blipFill>
-                  <pic:spPr bwMode="auto">
+                  <pic:spPr>
                     <a:xfrm>
                       <a:off x="0" y="0"/>
-                      <a:ext cx="5729605" cy="6870065"/>
+                      <a:ext cx="3974465" cy="5014595"/>
                     </a:xfrm>
                     <a:prstGeom prst="rect">
                       <a:avLst/>
                     </a:prstGeom>
-                    <a:noFill/>
-                    <a:ln>
-                      <a:noFill/>
-                    </a:ln>
                   </pic:spPr>
                 </pic:pic>
               </a:graphicData>
@@ -13120,233 +13334,299 @@
     <w:p>
       <w:pPr>
         <w:rPr>
-          <w:rFonts w:ascii="Helvetica" w:eastAsia="Times New Roman" w:hAnsi="Helvetica" w:cs="Times New Roman"/>
-          <w:color w:val="000000"/>
-          <w:kern w:val="0"/>
-          <w:sz w:val="14"/>
-          <w:szCs w:val="14"/>
-          <w:lang w:eastAsia="en-GB"/>
-          <w14:ligatures w14:val="none"/>
-        </w:rPr>
-      </w:pPr>
-      <w:r>
-        <w:rPr>
-          <w:rFonts w:ascii="Helvetica" w:eastAsia="Times New Roman" w:hAnsi="Helvetica" w:cs="Times New Roman"/>
-          <w:color w:val="000000"/>
-          <w:kern w:val="0"/>
-          <w:sz w:val="14"/>
-          <w:szCs w:val="14"/>
-          <w:lang w:eastAsia="en-GB"/>
-          <w14:ligatures w14:val="none"/>
+          <w:lang w:eastAsia="en-GB"/>
+        </w:rPr>
+      </w:pPr>
+      <w:r>
+        <w:rPr>
+          <w:lang w:eastAsia="en-GB"/>
         </w:rPr>
         <w:lastRenderedPageBreak/>
-        <w:br w:type="page"/>
-      </w:r>
-    </w:p>
-    <w:p>
-      <w:pPr>
-        <w:pStyle w:val="Heading1"/>
-        <w:rPr>
-          <w:rFonts w:eastAsia="Times New Roman"/>
-          <w:lang w:eastAsia="en-GB"/>
-        </w:rPr>
-      </w:pPr>
-      <w:r>
-        <w:rPr>
-          <w:rFonts w:eastAsia="Times New Roman"/>
+        <w:drawing>
+          <wp:inline distT="0" distB="0" distL="0" distR="0" wp14:anchorId="4ACAB069" wp14:editId="3EA7E590">
+            <wp:extent cx="3974465" cy="5002530"/>
+            <wp:effectExtent l="0" t="0" r="6985" b="7620"/>
+            <wp:docPr id="433189288" name="Picture 1"/>
+            <wp:cNvGraphicFramePr>
+              <a:graphicFrameLocks xmlns:a="http://schemas.openxmlformats.org/drawingml/2006/main" noChangeAspect="1"/>
+            </wp:cNvGraphicFramePr>
+            <a:graphic xmlns:a="http://schemas.openxmlformats.org/drawingml/2006/main">
+              <a:graphicData uri="http://schemas.openxmlformats.org/drawingml/2006/picture">
+                <pic:pic xmlns:pic="http://schemas.openxmlformats.org/drawingml/2006/picture">
+                  <pic:nvPicPr>
+                    <pic:cNvPr id="433189288" name=""/>
+                    <pic:cNvPicPr/>
+                  </pic:nvPicPr>
+                  <pic:blipFill>
+                    <a:blip r:embed="rId24"/>
+                    <a:stretch>
+                      <a:fillRect/>
+                    </a:stretch>
+                  </pic:blipFill>
+                  <pic:spPr>
+                    <a:xfrm>
+                      <a:off x="0" y="0"/>
+                      <a:ext cx="3974465" cy="5002530"/>
+                    </a:xfrm>
+                    <a:prstGeom prst="rect">
+                      <a:avLst/>
+                    </a:prstGeom>
+                  </pic:spPr>
+                </pic:pic>
+              </a:graphicData>
+            </a:graphic>
+          </wp:inline>
+        </w:drawing>
+      </w:r>
+      <w:r>
+        <w:rPr>
           <w:lang w:eastAsia="en-GB"/>
         </w:rPr>
         <w:lastRenderedPageBreak/>
-        <w:t>Woggle</w:t>
-      </w:r>
-    </w:p>
-    <w:p>
-      <w:pPr>
-        <w:rPr>
-          <w:lang w:eastAsia="en-GB"/>
-        </w:rPr>
-      </w:pPr>
-      <w:r>
-        <w:rPr>
-          <w:lang w:eastAsia="en-GB"/>
-        </w:rPr>
-        <w:t xml:space="preserve">This is derived from the Scouts Queensland </w:t>
-      </w:r>
-      <w:proofErr w:type="spellStart"/>
-      <w:r>
-        <w:rPr>
-          <w:lang w:eastAsia="en-GB"/>
-        </w:rPr>
-        <w:t>eWoggle</w:t>
-      </w:r>
-      <w:proofErr w:type="spellEnd"/>
-      <w:r>
-        <w:rPr>
-          <w:lang w:eastAsia="en-GB"/>
-        </w:rPr>
-        <w:t>, and follows the design principles laid out in the document “</w:t>
-      </w:r>
-      <w:r>
-        <w:rPr>
-          <w:lang w:eastAsia="en-GB"/>
-        </w:rPr>
-        <w:t xml:space="preserve">Circuit design principles for </w:t>
-      </w:r>
-      <w:r>
-        <w:rPr>
-          <w:lang w:eastAsia="en-GB"/>
-        </w:rPr>
-        <w:t>Scout electronics projects for JOTA/JOTI“ by Michael Gross of Cobargo Venturers (</w:t>
-      </w:r>
-      <w:hyperlink r:id="rId16" w:history="1">
-        <w:r>
-          <w:rPr>
-            <w:lang w:eastAsia="en-GB"/>
-          </w:rPr>
-          <w:t>https://cobargoscouts.org.au/jota-joti-electronics.html</w:t>
-        </w:r>
-      </w:hyperlink>
-      <w:r>
-        <w:rPr>
-          <w:lang w:eastAsia="en-GB"/>
-        </w:rPr>
-        <w:t xml:space="preserve">), I have also combined the functionality of the </w:t>
-      </w:r>
-      <w:proofErr w:type="spellStart"/>
-      <w:r>
-        <w:rPr>
-          <w:lang w:eastAsia="en-GB"/>
-        </w:rPr>
-        <w:t>eWoggle</w:t>
-      </w:r>
-      <w:proofErr w:type="spellEnd"/>
-      <w:r>
-        <w:rPr>
-          <w:lang w:eastAsia="en-GB"/>
-        </w:rPr>
-        <w:t xml:space="preserve"> with the </w:t>
-      </w:r>
-      <w:proofErr w:type="spellStart"/>
-      <w:r>
-        <w:rPr>
-          <w:lang w:eastAsia="en-GB"/>
-        </w:rPr>
-        <w:t>Franzininho</w:t>
-      </w:r>
-      <w:proofErr w:type="spellEnd"/>
-      <w:r>
-        <w:rPr>
-          <w:lang w:eastAsia="en-GB"/>
-        </w:rPr>
-        <w:t xml:space="preserve"> DIY (</w:t>
-      </w:r>
-      <w:hyperlink r:id="rId17" w:history="1">
-        <w:r>
-          <w:rPr>
-            <w:lang w:eastAsia="en-GB"/>
-          </w:rPr>
-          <w:t>https://docs.franzininho.com.br/docs/franzininho-diy/sobre</w:t>
-        </w:r>
-      </w:hyperlink>
-      <w:r>
-        <w:rPr>
-          <w:lang w:eastAsia="en-GB"/>
-        </w:rPr>
-        <w:t>) Arduino like capabilities allowing the scouts to upload new firmware after they have assembled their woggles</w:t>
-      </w:r>
-      <w:r>
-        <w:rPr>
-          <w:lang w:eastAsia="en-GB"/>
-        </w:rPr>
-        <w:t>.</w:t>
-      </w:r>
-    </w:p>
-    <w:p>
-      <w:pPr>
-        <w:rPr>
-          <w:rFonts w:ascii="Helvetica" w:eastAsia="Times New Roman" w:hAnsi="Helvetica" w:cs="Times New Roman"/>
-          <w:color w:val="000000"/>
-          <w:kern w:val="0"/>
-          <w:sz w:val="14"/>
-          <w:szCs w:val="14"/>
-          <w:lang w:eastAsia="en-GB"/>
-          <w14:ligatures w14:val="none"/>
-        </w:rPr>
-      </w:pPr>
-      <w:r>
-        <w:rPr>
-          <w:rFonts w:ascii="Helvetica" w:eastAsia="Times New Roman" w:hAnsi="Helvetica" w:cs="Times New Roman"/>
-          <w:color w:val="000000"/>
-          <w:kern w:val="0"/>
-          <w:sz w:val="14"/>
-          <w:szCs w:val="14"/>
-          <w:lang w:eastAsia="en-GB"/>
-          <w14:ligatures w14:val="none"/>
-        </w:rPr>
-        <w:br w:type="page"/>
-      </w:r>
-    </w:p>
-    <w:p>
-      <w:pPr>
-        <w:pStyle w:val="Heading2"/>
-        <w:rPr>
-          <w:rFonts w:eastAsia="Times New Roman"/>
-          <w:lang w:eastAsia="en-GB"/>
-        </w:rPr>
-      </w:pPr>
-      <w:r>
-        <w:rPr>
-          <w:rFonts w:eastAsia="Times New Roman"/>
+        <w:drawing>
+          <wp:inline distT="0" distB="0" distL="0" distR="0" wp14:anchorId="3D8940D2" wp14:editId="10362B37">
+            <wp:extent cx="3974465" cy="4996815"/>
+            <wp:effectExtent l="0" t="0" r="6985" b="0"/>
+            <wp:docPr id="1778022899" name="Picture 1"/>
+            <wp:cNvGraphicFramePr>
+              <a:graphicFrameLocks xmlns:a="http://schemas.openxmlformats.org/drawingml/2006/main" noChangeAspect="1"/>
+            </wp:cNvGraphicFramePr>
+            <a:graphic xmlns:a="http://schemas.openxmlformats.org/drawingml/2006/main">
+              <a:graphicData uri="http://schemas.openxmlformats.org/drawingml/2006/picture">
+                <pic:pic xmlns:pic="http://schemas.openxmlformats.org/drawingml/2006/picture">
+                  <pic:nvPicPr>
+                    <pic:cNvPr id="1778022899" name=""/>
+                    <pic:cNvPicPr/>
+                  </pic:nvPicPr>
+                  <pic:blipFill>
+                    <a:blip r:embed="rId25"/>
+                    <a:stretch>
+                      <a:fillRect/>
+                    </a:stretch>
+                  </pic:blipFill>
+                  <pic:spPr>
+                    <a:xfrm>
+                      <a:off x="0" y="0"/>
+                      <a:ext cx="3974465" cy="4996815"/>
+                    </a:xfrm>
+                    <a:prstGeom prst="rect">
+                      <a:avLst/>
+                    </a:prstGeom>
+                  </pic:spPr>
+                </pic:pic>
+              </a:graphicData>
+            </a:graphic>
+          </wp:inline>
+        </w:drawing>
+      </w:r>
+      <w:r>
+        <w:rPr>
           <w:lang w:eastAsia="en-GB"/>
         </w:rPr>
         <w:lastRenderedPageBreak/>
-        <w:t xml:space="preserve">Woggle </w:t>
-      </w:r>
-      <w:proofErr w:type="spellStart"/>
-      <w:r>
-        <w:rPr>
-          <w:rFonts w:eastAsia="Times New Roman"/>
-          <w:lang w:eastAsia="en-GB"/>
-        </w:rPr>
-        <w:t>KiCad</w:t>
-      </w:r>
-      <w:proofErr w:type="spellEnd"/>
-      <w:r>
-        <w:rPr>
-          <w:rFonts w:eastAsia="Times New Roman"/>
-          <w:lang w:eastAsia="en-GB"/>
-        </w:rPr>
-        <w:t xml:space="preserve"> files</w:t>
-      </w:r>
-    </w:p>
-    <w:p>
-      <w:pPr>
-        <w:rPr>
-          <w:lang w:eastAsia="en-GB"/>
-        </w:rPr>
-      </w:pPr>
-      <w:r>
-        <w:rPr>
-          <w:lang w:eastAsia="en-GB"/>
-        </w:rPr>
-        <w:t xml:space="preserve">The woggle was designed in </w:t>
-      </w:r>
-      <w:proofErr w:type="spellStart"/>
-      <w:r>
-        <w:rPr>
-          <w:lang w:eastAsia="en-GB"/>
-        </w:rPr>
-        <w:t>KiCad</w:t>
-      </w:r>
-      <w:proofErr w:type="spellEnd"/>
-      <w:r>
-        <w:rPr>
-          <w:lang w:eastAsia="en-GB"/>
-        </w:rPr>
-        <w:t xml:space="preserve">, </w:t>
+        <w:drawing>
+          <wp:inline distT="0" distB="0" distL="0" distR="0" wp14:anchorId="4510E933" wp14:editId="57A5F43A">
+            <wp:extent cx="3974465" cy="4994275"/>
+            <wp:effectExtent l="0" t="0" r="6985" b="0"/>
+            <wp:docPr id="1660991746" name="Picture 1"/>
+            <wp:cNvGraphicFramePr>
+              <a:graphicFrameLocks xmlns:a="http://schemas.openxmlformats.org/drawingml/2006/main" noChangeAspect="1"/>
+            </wp:cNvGraphicFramePr>
+            <a:graphic xmlns:a="http://schemas.openxmlformats.org/drawingml/2006/main">
+              <a:graphicData uri="http://schemas.openxmlformats.org/drawingml/2006/picture">
+                <pic:pic xmlns:pic="http://schemas.openxmlformats.org/drawingml/2006/picture">
+                  <pic:nvPicPr>
+                    <pic:cNvPr id="1660991746" name=""/>
+                    <pic:cNvPicPr/>
+                  </pic:nvPicPr>
+                  <pic:blipFill>
+                    <a:blip r:embed="rId26"/>
+                    <a:stretch>
+                      <a:fillRect/>
+                    </a:stretch>
+                  </pic:blipFill>
+                  <pic:spPr>
+                    <a:xfrm>
+                      <a:off x="0" y="0"/>
+                      <a:ext cx="3974465" cy="4994275"/>
+                    </a:xfrm>
+                    <a:prstGeom prst="rect">
+                      <a:avLst/>
+                    </a:prstGeom>
+                  </pic:spPr>
+                </pic:pic>
+              </a:graphicData>
+            </a:graphic>
+          </wp:inline>
+        </w:drawing>
+      </w:r>
+      <w:r>
+        <w:rPr>
+          <w:lang w:eastAsia="en-GB"/>
+        </w:rPr>
+        <w:lastRenderedPageBreak/>
+        <w:drawing>
+          <wp:inline distT="0" distB="0" distL="0" distR="0" wp14:anchorId="7E279257" wp14:editId="7290E995">
+            <wp:extent cx="3974465" cy="5009515"/>
+            <wp:effectExtent l="0" t="0" r="6985" b="635"/>
+            <wp:docPr id="944914461" name="Picture 1"/>
+            <wp:cNvGraphicFramePr>
+              <a:graphicFrameLocks xmlns:a="http://schemas.openxmlformats.org/drawingml/2006/main" noChangeAspect="1"/>
+            </wp:cNvGraphicFramePr>
+            <a:graphic xmlns:a="http://schemas.openxmlformats.org/drawingml/2006/main">
+              <a:graphicData uri="http://schemas.openxmlformats.org/drawingml/2006/picture">
+                <pic:pic xmlns:pic="http://schemas.openxmlformats.org/drawingml/2006/picture">
+                  <pic:nvPicPr>
+                    <pic:cNvPr id="944914461" name=""/>
+                    <pic:cNvPicPr/>
+                  </pic:nvPicPr>
+                  <pic:blipFill>
+                    <a:blip r:embed="rId27"/>
+                    <a:stretch>
+                      <a:fillRect/>
+                    </a:stretch>
+                  </pic:blipFill>
+                  <pic:spPr>
+                    <a:xfrm>
+                      <a:off x="0" y="0"/>
+                      <a:ext cx="3974465" cy="5009515"/>
+                    </a:xfrm>
+                    <a:prstGeom prst="rect">
+                      <a:avLst/>
+                    </a:prstGeom>
+                  </pic:spPr>
+                </pic:pic>
+              </a:graphicData>
+            </a:graphic>
+          </wp:inline>
+        </w:drawing>
+      </w:r>
+      <w:r>
+        <w:rPr>
+          <w:lang w:eastAsia="en-GB"/>
+        </w:rPr>
+        <w:lastRenderedPageBreak/>
+        <w:drawing>
+          <wp:inline distT="0" distB="0" distL="0" distR="0" wp14:anchorId="00D48361" wp14:editId="28CA32EC">
+            <wp:extent cx="3974465" cy="5010785"/>
+            <wp:effectExtent l="0" t="0" r="6985" b="0"/>
+            <wp:docPr id="1278343332" name="Picture 1"/>
+            <wp:cNvGraphicFramePr>
+              <a:graphicFrameLocks xmlns:a="http://schemas.openxmlformats.org/drawingml/2006/main" noChangeAspect="1"/>
+            </wp:cNvGraphicFramePr>
+            <a:graphic xmlns:a="http://schemas.openxmlformats.org/drawingml/2006/main">
+              <a:graphicData uri="http://schemas.openxmlformats.org/drawingml/2006/picture">
+                <pic:pic xmlns:pic="http://schemas.openxmlformats.org/drawingml/2006/picture">
+                  <pic:nvPicPr>
+                    <pic:cNvPr id="1278343332" name=""/>
+                    <pic:cNvPicPr/>
+                  </pic:nvPicPr>
+                  <pic:blipFill>
+                    <a:blip r:embed="rId28"/>
+                    <a:stretch>
+                      <a:fillRect/>
+                    </a:stretch>
+                  </pic:blipFill>
+                  <pic:spPr>
+                    <a:xfrm>
+                      <a:off x="0" y="0"/>
+                      <a:ext cx="3974465" cy="5010785"/>
+                    </a:xfrm>
+                    <a:prstGeom prst="rect">
+                      <a:avLst/>
+                    </a:prstGeom>
+                  </pic:spPr>
+                </pic:pic>
+              </a:graphicData>
+            </a:graphic>
+          </wp:inline>
+        </w:drawing>
+      </w:r>
+      <w:r>
+        <w:rPr>
+          <w:lang w:eastAsia="en-GB"/>
+        </w:rPr>
+        <w:lastRenderedPageBreak/>
+        <w:drawing>
+          <wp:inline distT="0" distB="0" distL="0" distR="0" wp14:anchorId="190D5B31" wp14:editId="50ED0B1E">
+            <wp:extent cx="3974465" cy="5006340"/>
+            <wp:effectExtent l="0" t="0" r="6985" b="3810"/>
+            <wp:docPr id="1688650297" name="Picture 1"/>
+            <wp:cNvGraphicFramePr>
+              <a:graphicFrameLocks xmlns:a="http://schemas.openxmlformats.org/drawingml/2006/main" noChangeAspect="1"/>
+            </wp:cNvGraphicFramePr>
+            <a:graphic xmlns:a="http://schemas.openxmlformats.org/drawingml/2006/main">
+              <a:graphicData uri="http://schemas.openxmlformats.org/drawingml/2006/picture">
+                <pic:pic xmlns:pic="http://schemas.openxmlformats.org/drawingml/2006/picture">
+                  <pic:nvPicPr>
+                    <pic:cNvPr id="1688650297" name=""/>
+                    <pic:cNvPicPr/>
+                  </pic:nvPicPr>
+                  <pic:blipFill>
+                    <a:blip r:embed="rId29"/>
+                    <a:stretch>
+                      <a:fillRect/>
+                    </a:stretch>
+                  </pic:blipFill>
+                  <pic:spPr>
+                    <a:xfrm>
+                      <a:off x="0" y="0"/>
+                      <a:ext cx="3974465" cy="5006340"/>
+                    </a:xfrm>
+                    <a:prstGeom prst="rect">
+                      <a:avLst/>
+                    </a:prstGeom>
+                  </pic:spPr>
+                </pic:pic>
+              </a:graphicData>
+            </a:graphic>
+          </wp:inline>
+        </w:drawing>
+      </w:r>
+      <w:r>
+        <w:rPr>
+          <w:lang w:eastAsia="en-GB"/>
+        </w:rPr>
+        <w:lastRenderedPageBreak/>
+        <w:drawing>
+          <wp:inline distT="0" distB="0" distL="0" distR="0" wp14:anchorId="634FEE9A" wp14:editId="731B8D99">
+            <wp:extent cx="3974465" cy="4993005"/>
+            <wp:effectExtent l="0" t="0" r="6985" b="0"/>
+            <wp:docPr id="1259458854" name="Picture 1"/>
+            <wp:cNvGraphicFramePr>
+              <a:graphicFrameLocks xmlns:a="http://schemas.openxmlformats.org/drawingml/2006/main" noChangeAspect="1"/>
+            </wp:cNvGraphicFramePr>
+            <a:graphic xmlns:a="http://schemas.openxmlformats.org/drawingml/2006/main">
+              <a:graphicData uri="http://schemas.openxmlformats.org/drawingml/2006/picture">
+                <pic:pic xmlns:pic="http://schemas.openxmlformats.org/drawingml/2006/picture">
+                  <pic:nvPicPr>
+                    <pic:cNvPr id="1259458854" name=""/>
+                    <pic:cNvPicPr/>
+                  </pic:nvPicPr>
+                  <pic:blipFill>
+                    <a:blip r:embed="rId30"/>
+                    <a:stretch>
+                      <a:fillRect/>
+                    </a:stretch>
+                  </pic:blipFill>
+                  <pic:spPr>
+                    <a:xfrm>
+                      <a:off x="0" y="0"/>
+                      <a:ext cx="3974465" cy="4993005"/>
+                    </a:xfrm>
+                    <a:prstGeom prst="rect">
+                      <a:avLst/>
+                    </a:prstGeom>
+                  </pic:spPr>
+                </pic:pic>
+              </a:graphicData>
+            </a:graphic>
+          </wp:inline>
+        </w:drawing>
       </w:r>
     </w:p>
     <w:sectPr>
+      <w:headerReference w:type="first" r:id="rId31"/>
       <w:pgSz w:w="8419" w:h="11906" w:orient="landscape" w:code="9"/>
       <w:pgMar w:top="720" w:right="720" w:bottom="720" w:left="720" w:header="709" w:footer="709" w:gutter="720"/>
       <w:pgNumType w:start="0"/>
@@ -13356,6 +13636,137 @@
     </w:sectPr>
   </w:body>
 </w:document>
+</file>
+
+<file path=word/endnotes.xml><?xml version="1.0" encoding="utf-8"?>
+<w:endnotes xmlns:wpc="http://schemas.microsoft.com/office/word/2010/wordprocessingCanvas" xmlns:cx="http://schemas.microsoft.com/office/drawing/2014/chartex" xmlns:cx1="http://schemas.microsoft.com/office/drawing/2015/9/8/chartex" xmlns:cx2="http://schemas.microsoft.com/office/drawing/2015/10/21/chartex" xmlns:cx3="http://schemas.microsoft.com/office/drawing/2016/5/9/chartex" xmlns:cx4="http://schemas.microsoft.com/office/drawing/2016/5/10/chartex" xmlns:cx5="http://schemas.microsoft.com/office/drawing/2016/5/11/chartex" xmlns:cx6="http://schemas.microsoft.com/office/drawing/2016/5/12/chartex" xmlns:cx7="http://schemas.microsoft.com/office/drawing/2016/5/13/chartex" xmlns:cx8="http://schemas.microsoft.com/office/drawing/2016/5/14/chartex" xmlns:mc="http://schemas.openxmlformats.org/markup-compatibility/2006" xmlns:aink="http://schemas.microsoft.com/office/drawing/2016/ink" xmlns:am3d="http://schemas.microsoft.com/office/drawing/2017/model3d" xmlns:o="urn:schemas-microsoft-com:office:office" xmlns:oel="http://schemas.microsoft.com/office/2019/extlst" xmlns:r="http://schemas.openxmlformats.org/officeDocument/2006/relationships" xmlns:m="http://schemas.openxmlformats.org/officeDocument/2006/math" xmlns:v="urn:schemas-microsoft-com:vml" xmlns:wp14="http://schemas.microsoft.com/office/word/2010/wordprocessingDrawing" xmlns:wp="http://schemas.openxmlformats.org/drawingml/2006/wordprocessingDrawing" xmlns:w10="urn:schemas-microsoft-com:office:word" xmlns:w="http://schemas.openxmlformats.org/wordprocessingml/2006/main" xmlns:w14="http://schemas.microsoft.com/office/word/2010/wordml" xmlns:w15="http://schemas.microsoft.com/office/word/2012/wordml" xmlns:w16cex="http://schemas.microsoft.com/office/word/2018/wordml/cex" xmlns:w16cid="http://schemas.microsoft.com/office/word/2016/wordml/cid" xmlns:w16="http://schemas.microsoft.com/office/word/2018/wordml" xmlns:w16du="http://schemas.microsoft.com/office/word/2023/wordml/word16du" xmlns:w16sdtdh="http://schemas.microsoft.com/office/word/2020/wordml/sdtdatahash" xmlns:w16sdtfl="http://schemas.microsoft.com/office/word/2024/wordml/sdtformatlock" xmlns:w16se="http://schemas.microsoft.com/office/word/2015/wordml/symex" xmlns:wpg="http://schemas.microsoft.com/office/word/2010/wordprocessingGroup" xmlns:wpi="http://schemas.microsoft.com/office/word/2010/wordprocessingInk" xmlns:wne="http://schemas.microsoft.com/office/word/2006/wordml" xmlns:wps="http://schemas.microsoft.com/office/word/2010/wordprocessingShape" mc:Ignorable="w14 w15 w16se w16cid w16 w16cex w16sdtdh w16sdtfl w16du wp14">
+  <w:endnote w:type="separator" w:id="-1">
+    <w:p>
+      <w:pPr>
+        <w:spacing w:after="0" w:line="240" w:lineRule="auto"/>
+      </w:pPr>
+      <w:r>
+        <w:separator/>
+      </w:r>
+    </w:p>
+  </w:endnote>
+  <w:endnote w:type="continuationSeparator" w:id="0">
+    <w:p>
+      <w:pPr>
+        <w:spacing w:after="0" w:line="240" w:lineRule="auto"/>
+      </w:pPr>
+      <w:r>
+        <w:continuationSeparator/>
+      </w:r>
+    </w:p>
+  </w:endnote>
+</w:endnotes>
+</file>
+
+<file path=word/footnotes.xml><?xml version="1.0" encoding="utf-8"?>
+<w:footnotes xmlns:wpc="http://schemas.microsoft.com/office/word/2010/wordprocessingCanvas" xmlns:cx="http://schemas.microsoft.com/office/drawing/2014/chartex" xmlns:cx1="http://schemas.microsoft.com/office/drawing/2015/9/8/chartex" xmlns:cx2="http://schemas.microsoft.com/office/drawing/2015/10/21/chartex" xmlns:cx3="http://schemas.microsoft.com/office/drawing/2016/5/9/chartex" xmlns:cx4="http://schemas.microsoft.com/office/drawing/2016/5/10/chartex" xmlns:cx5="http://schemas.microsoft.com/office/drawing/2016/5/11/chartex" xmlns:cx6="http://schemas.microsoft.com/office/drawing/2016/5/12/chartex" xmlns:cx7="http://schemas.microsoft.com/office/drawing/2016/5/13/chartex" xmlns:cx8="http://schemas.microsoft.com/office/drawing/2016/5/14/chartex" xmlns:mc="http://schemas.openxmlformats.org/markup-compatibility/2006" xmlns:aink="http://schemas.microsoft.com/office/drawing/2016/ink" xmlns:am3d="http://schemas.microsoft.com/office/drawing/2017/model3d" xmlns:o="urn:schemas-microsoft-com:office:office" xmlns:oel="http://schemas.microsoft.com/office/2019/extlst" xmlns:r="http://schemas.openxmlformats.org/officeDocument/2006/relationships" xmlns:m="http://schemas.openxmlformats.org/officeDocument/2006/math" xmlns:v="urn:schemas-microsoft-com:vml" xmlns:wp14="http://schemas.microsoft.com/office/word/2010/wordprocessingDrawing" xmlns:wp="http://schemas.openxmlformats.org/drawingml/2006/wordprocessingDrawing" xmlns:w10="urn:schemas-microsoft-com:office:word" xmlns:w="http://schemas.openxmlformats.org/wordprocessingml/2006/main" xmlns:w14="http://schemas.microsoft.com/office/word/2010/wordml" xmlns:w15="http://schemas.microsoft.com/office/word/2012/wordml" xmlns:w16cex="http://schemas.microsoft.com/office/word/2018/wordml/cex" xmlns:w16cid="http://schemas.microsoft.com/office/word/2016/wordml/cid" xmlns:w16="http://schemas.microsoft.com/office/word/2018/wordml" xmlns:w16du="http://schemas.microsoft.com/office/word/2023/wordml/word16du" xmlns:w16sdtdh="http://schemas.microsoft.com/office/word/2020/wordml/sdtdatahash" xmlns:w16sdtfl="http://schemas.microsoft.com/office/word/2024/wordml/sdtformatlock" xmlns:w16se="http://schemas.microsoft.com/office/word/2015/wordml/symex" xmlns:wpg="http://schemas.microsoft.com/office/word/2010/wordprocessingGroup" xmlns:wpi="http://schemas.microsoft.com/office/word/2010/wordprocessingInk" xmlns:wne="http://schemas.microsoft.com/office/word/2006/wordml" xmlns:wps="http://schemas.microsoft.com/office/word/2010/wordprocessingShape" mc:Ignorable="w14 w15 w16se w16cid w16 w16cex w16sdtdh w16sdtfl w16du wp14">
+  <w:footnote w:type="separator" w:id="-1">
+    <w:p>
+      <w:pPr>
+        <w:spacing w:after="0" w:line="240" w:lineRule="auto"/>
+      </w:pPr>
+      <w:r>
+        <w:separator/>
+      </w:r>
+    </w:p>
+  </w:footnote>
+  <w:footnote w:type="continuationSeparator" w:id="0">
+    <w:p>
+      <w:pPr>
+        <w:spacing w:after="0" w:line="240" w:lineRule="auto"/>
+      </w:pPr>
+      <w:r>
+        <w:continuationSeparator/>
+      </w:r>
+    </w:p>
+  </w:footnote>
+</w:footnotes>
+</file>
+
+<file path=word/header1.xml><?xml version="1.0" encoding="utf-8"?>
+<w:hdr xmlns:wpc="http://schemas.microsoft.com/office/word/2010/wordprocessingCanvas" xmlns:cx="http://schemas.microsoft.com/office/drawing/2014/chartex" xmlns:cx1="http://schemas.microsoft.com/office/drawing/2015/9/8/chartex" xmlns:cx2="http://schemas.microsoft.com/office/drawing/2015/10/21/chartex" xmlns:cx3="http://schemas.microsoft.com/office/drawing/2016/5/9/chartex" xmlns:cx4="http://schemas.microsoft.com/office/drawing/2016/5/10/chartex" xmlns:cx5="http://schemas.microsoft.com/office/drawing/2016/5/11/chartex" xmlns:cx6="http://schemas.microsoft.com/office/drawing/2016/5/12/chartex" xmlns:cx7="http://schemas.microsoft.com/office/drawing/2016/5/13/chartex" xmlns:cx8="http://schemas.microsoft.com/office/drawing/2016/5/14/chartex" xmlns:mc="http://schemas.openxmlformats.org/markup-compatibility/2006" xmlns:aink="http://schemas.microsoft.com/office/drawing/2016/ink" xmlns:am3d="http://schemas.microsoft.com/office/drawing/2017/model3d" xmlns:o="urn:schemas-microsoft-com:office:office" xmlns:oel="http://schemas.microsoft.com/office/2019/extlst" xmlns:r="http://schemas.openxmlformats.org/officeDocument/2006/relationships" xmlns:m="http://schemas.openxmlformats.org/officeDocument/2006/math" xmlns:v="urn:schemas-microsoft-com:vml" xmlns:wp14="http://schemas.microsoft.com/office/word/2010/wordprocessingDrawing" xmlns:wp="http://schemas.openxmlformats.org/drawingml/2006/wordprocessingDrawing" xmlns:w10="urn:schemas-microsoft-com:office:word" xmlns:w="http://schemas.openxmlformats.org/wordprocessingml/2006/main" xmlns:w14="http://schemas.microsoft.com/office/word/2010/wordml" xmlns:w15="http://schemas.microsoft.com/office/word/2012/wordml" xmlns:w16cex="http://schemas.microsoft.com/office/word/2018/wordml/cex" xmlns:w16cid="http://schemas.microsoft.com/office/word/2016/wordml/cid" xmlns:w16="http://schemas.microsoft.com/office/word/2018/wordml" xmlns:w16du="http://schemas.microsoft.com/office/word/2023/wordml/word16du" xmlns:w16sdtdh="http://schemas.microsoft.com/office/word/2020/wordml/sdtdatahash" xmlns:w16sdtfl="http://schemas.microsoft.com/office/word/2024/wordml/sdtformatlock" xmlns:w16se="http://schemas.microsoft.com/office/word/2015/wordml/symex" xmlns:wpg="http://schemas.microsoft.com/office/word/2010/wordprocessingGroup" xmlns:wpi="http://schemas.microsoft.com/office/word/2010/wordprocessingInk" xmlns:wne="http://schemas.microsoft.com/office/word/2006/wordml" xmlns:wps="http://schemas.microsoft.com/office/word/2010/wordprocessingShape" mc:Ignorable="w14 w15 w16se w16cid w16 w16cex w16sdtdh w16sdtfl w16du wp14">
+  <w:p>
+    <w:pPr>
+      <w:pStyle w:val="Header"/>
+    </w:pPr>
+    <w:r>
+      <w:rPr>
+        <w:rFonts w:asciiTheme="majorHAnsi" w:eastAsiaTheme="majorEastAsia" w:hAnsiTheme="majorHAnsi" w:cstheme="majorBidi"/>
+        <w:noProof/>
+        <w:color w:val="156082" w:themeColor="accent1"/>
+        <w:sz w:val="88"/>
+        <w:szCs w:val="88"/>
+      </w:rPr>
+      <w:drawing>
+        <wp:anchor distT="0" distB="0" distL="114300" distR="114300" simplePos="0" relativeHeight="251658240" behindDoc="1" locked="0" layoutInCell="1" allowOverlap="1" wp14:anchorId="7415B48E" wp14:editId="5B5CD1DC">
+          <wp:simplePos x="0" y="0"/>
+          <wp:positionH relativeFrom="column">
+            <wp:posOffset>0</wp:posOffset>
+          </wp:positionH>
+          <wp:positionV relativeFrom="paragraph">
+            <wp:posOffset>-295468</wp:posOffset>
+          </wp:positionV>
+          <wp:extent cx="3184525" cy="3212465"/>
+          <wp:effectExtent l="0" t="0" r="0" b="6985"/>
+          <wp:wrapNone/>
+          <wp:docPr id="1167004258" name="Picture 1"/>
+          <wp:cNvGraphicFramePr>
+            <a:graphicFrameLocks xmlns:a="http://schemas.openxmlformats.org/drawingml/2006/main" noChangeAspect="1"/>
+          </wp:cNvGraphicFramePr>
+          <a:graphic xmlns:a="http://schemas.openxmlformats.org/drawingml/2006/main">
+            <a:graphicData uri="http://schemas.openxmlformats.org/drawingml/2006/picture">
+              <pic:pic xmlns:pic="http://schemas.openxmlformats.org/drawingml/2006/picture">
+                <pic:nvPicPr>
+                  <pic:cNvPr id="0" name="Picture 1"/>
+                  <pic:cNvPicPr>
+                    <a:picLocks noChangeAspect="1" noChangeArrowheads="1"/>
+                  </pic:cNvPicPr>
+                </pic:nvPicPr>
+                <pic:blipFill>
+                  <a:blip r:embed="rId1">
+                    <a:extLst>
+                      <a:ext uri="{28A0092B-C50C-407E-A947-70E740481C1C}">
+                        <a14:useLocalDpi xmlns:a14="http://schemas.microsoft.com/office/drawing/2010/main" val="0"/>
+                      </a:ext>
+                    </a:extLst>
+                  </a:blip>
+                  <a:srcRect/>
+                  <a:stretch>
+                    <a:fillRect/>
+                  </a:stretch>
+                </pic:blipFill>
+                <pic:spPr bwMode="auto">
+                  <a:xfrm>
+                    <a:off x="0" y="0"/>
+                    <a:ext cx="3184525" cy="3212465"/>
+                  </a:xfrm>
+                  <a:prstGeom prst="rect">
+                    <a:avLst/>
+                  </a:prstGeom>
+                  <a:noFill/>
+                  <a:ln>
+                    <a:noFill/>
+                  </a:ln>
+                </pic:spPr>
+              </pic:pic>
+            </a:graphicData>
+          </a:graphic>
+          <wp14:sizeRelH relativeFrom="page">
+            <wp14:pctWidth>0</wp14:pctWidth>
+          </wp14:sizeRelH>
+          <wp14:sizeRelV relativeFrom="page">
+            <wp14:pctHeight>0</wp14:pctHeight>
+          </wp14:sizeRelV>
+        </wp:anchor>
+      </w:drawing>
+    </w:r>
+  </w:p>
+</w:hdr>
 </file>
 
 <file path=word/numbering.xml><?xml version="1.0" encoding="utf-8"?>
@@ -14964,7 +15375,6 @@
   <w:style w:type="character" w:default="1" w:styleId="DefaultParagraphFont">
     <w:name w:val="Default Paragraph Font"/>
     <w:uiPriority w:val="1"/>
-    <w:semiHidden/>
     <w:unhideWhenUsed/>
   </w:style>
   <w:style w:type="table" w:default="1" w:styleId="TableNormal">
@@ -15405,6 +15815,50 @@
       <w14:ligatures w14:val="none"/>
     </w:rPr>
   </w:style>
+  <w:style w:type="paragraph" w:styleId="Header">
+    <w:name w:val="header"/>
+    <w:basedOn w:val="Normal"/>
+    <w:link w:val="HeaderChar"/>
+    <w:uiPriority w:val="99"/>
+    <w:unhideWhenUsed/>
+    <w:rsid w:val="002F5768"/>
+    <w:pPr>
+      <w:tabs>
+        <w:tab w:val="center" w:pos="4513"/>
+        <w:tab w:val="right" w:pos="9026"/>
+      </w:tabs>
+      <w:spacing w:after="0" w:line="240" w:lineRule="auto"/>
+    </w:pPr>
+  </w:style>
+  <w:style w:type="character" w:customStyle="1" w:styleId="HeaderChar">
+    <w:name w:val="Header Char"/>
+    <w:basedOn w:val="DefaultParagraphFont"/>
+    <w:link w:val="Header"/>
+    <w:uiPriority w:val="99"/>
+    <w:rsid w:val="002F5768"/>
+  </w:style>
+  <w:style w:type="paragraph" w:styleId="Footer">
+    <w:name w:val="footer"/>
+    <w:basedOn w:val="Normal"/>
+    <w:link w:val="FooterChar"/>
+    <w:uiPriority w:val="99"/>
+    <w:unhideWhenUsed/>
+    <w:rsid w:val="002F5768"/>
+    <w:pPr>
+      <w:tabs>
+        <w:tab w:val="center" w:pos="4513"/>
+        <w:tab w:val="right" w:pos="9026"/>
+      </w:tabs>
+      <w:spacing w:after="0" w:line="240" w:lineRule="auto"/>
+    </w:pPr>
+  </w:style>
+  <w:style w:type="character" w:customStyle="1" w:styleId="FooterChar">
+    <w:name w:val="Footer Char"/>
+    <w:basedOn w:val="DefaultParagraphFont"/>
+    <w:link w:val="Footer"/>
+    <w:uiPriority w:val="99"/>
+    <w:rsid w:val="002F5768"/>
+  </w:style>
 </w:styles>
 </file>
 
@@ -15642,9 +16096,12 @@
   </w:compat>
   <w:rsids>
     <w:rsidRoot w:val="00D828F1"/>
+    <w:rsid w:val="004B5599"/>
     <w:rsid w:val="00757093"/>
     <w:rsid w:val="0084129C"/>
+    <w:rsid w:val="008C2750"/>
     <w:rsid w:val="00D828F1"/>
+    <w:rsid w:val="00F25F04"/>
   </w:rsids>
   <m:mathPr>
     <m:mathFont m:val="Cambria Math"/>

</xml_diff>